<commit_message>
Update course materials: CMP 417 & DHS 413
Update Distributed Database docx for CMP 417 and add a PDF export; include an Office temporary lock file (~$...) in CMP 417. Update LECTURE PLANNING.pptx for DHS 413 and add a new Project Communications.pptx. These changes refresh course materials and supply a PDF version for CMP 417.
</commit_message>
<xml_diff>
--- a/CMP 417/Distributed_Database_Ajayi_Oluwapelumi.docx
+++ b/CMP 417/Distributed_Database_Ajayi_Oluwapelumi.docx
@@ -199,7 +199,11 @@
         <w:t>Database Management II</w:t>
       </w:r>
     </w:p>
-    <w:p/>
+    <w:p>
+      <w:pPr>
+        <w:jc w:val="both"/>
+      </w:pPr>
+    </w:p>
     <w:p>
       <w:pPr>
         <w:jc w:val="center"/>
@@ -225,6 +229,7 @@
     <w:p>
       <w:pPr>
         <w:spacing w:before="100" w:beforeAutospacing="1" w:after="100" w:afterAutospacing="1" w:line="240" w:lineRule="auto"/>
+        <w:jc w:val="both"/>
         <w:outlineLvl w:val="2"/>
         <w:rPr>
           <w:rFonts w:ascii="Times New Roman" w:eastAsia="Times New Roman" w:hAnsi="Times New Roman" w:cs="Times New Roman"/>
@@ -232,7 +237,7 @@
           <w:bCs/>
           <w:sz w:val="27"/>
           <w:szCs w:val="27"/>
-          <w:lang w:val="en-NG" w:eastAsia="en-NG"/>
+          <w:lang w:eastAsia="en-NG"/>
         </w:rPr>
       </w:pPr>
       <w:r>
@@ -242,74 +247,59 @@
           <w:bCs/>
           <w:sz w:val="27"/>
           <w:szCs w:val="27"/>
-          <w:lang w:val="en-NG" w:eastAsia="en-NG"/>
+          <w:lang w:eastAsia="en-NG"/>
         </w:rPr>
         <w:t>Definition of a Distributed Database</w:t>
       </w:r>
     </w:p>
     <w:p>
       <w:pPr>
+        <w:spacing w:before="100" w:beforeAutospacing="1" w:after="100" w:afterAutospacing="1" w:line="360" w:lineRule="auto"/>
+        <w:jc w:val="both"/>
+        <w:outlineLvl w:val="2"/>
+        <w:rPr>
+          <w:rFonts w:ascii="Times New Roman" w:eastAsia="Times New Roman" w:hAnsi="Times New Roman" w:cs="Times New Roman"/>
+          <w:sz w:val="24"/>
+          <w:szCs w:val="24"/>
+          <w:lang w:eastAsia="en-NG"/>
+        </w:rPr>
+      </w:pPr>
+      <w:r>
+        <w:rPr>
+          <w:rFonts w:ascii="Times New Roman" w:eastAsia="Times New Roman" w:hAnsi="Times New Roman" w:cs="Times New Roman"/>
+          <w:sz w:val="24"/>
+          <w:szCs w:val="24"/>
+          <w:lang w:eastAsia="en-NG"/>
+        </w:rPr>
+        <w:t>A distributed database is a single logical database that is dispersed physically over a number of geographically located computers that are linked together through a data communications network. From the users' point of view, it appears to be a single, coherent database, but in fact the data will be distributed across many sites and maintained independently on different computers, (known as sites or nodes).</w:t>
+      </w:r>
+    </w:p>
+    <w:p>
+      <w:pPr>
+        <w:spacing w:before="100" w:beforeAutospacing="1" w:after="100" w:afterAutospacing="1" w:line="360" w:lineRule="auto"/>
+        <w:jc w:val="both"/>
+        <w:outlineLvl w:val="2"/>
+        <w:rPr>
+          <w:rFonts w:ascii="Times New Roman" w:eastAsia="Times New Roman" w:hAnsi="Times New Roman" w:cs="Times New Roman"/>
+          <w:sz w:val="24"/>
+          <w:szCs w:val="24"/>
+          <w:lang w:eastAsia="en-NG"/>
+        </w:rPr>
+      </w:pPr>
+      <w:r>
+        <w:rPr>
+          <w:rFonts w:ascii="Times New Roman" w:eastAsia="Times New Roman" w:hAnsi="Times New Roman" w:cs="Times New Roman"/>
+          <w:sz w:val="24"/>
+          <w:szCs w:val="24"/>
+          <w:lang w:eastAsia="en-NG"/>
+        </w:rPr>
+        <w:t>Each site will maintain its own local database, local DBMS and yet they will co-operate together in maintaining the global database. The main feature being that the system manipulates distributed data without any noticeable differences to the user.</w:t>
+      </w:r>
+    </w:p>
+    <w:p>
+      <w:pPr>
         <w:spacing w:before="100" w:beforeAutospacing="1" w:after="100" w:afterAutospacing="1" w:line="240" w:lineRule="auto"/>
-        <w:outlineLvl w:val="2"/>
-        <w:rPr>
-          <w:rFonts w:ascii="Times New Roman" w:eastAsia="Times New Roman" w:hAnsi="Times New Roman" w:cs="Times New Roman"/>
-          <w:sz w:val="24"/>
-          <w:szCs w:val="24"/>
-          <w:lang w:val="en-NG" w:eastAsia="en-NG"/>
-        </w:rPr>
-      </w:pPr>
-      <w:r>
-        <w:rPr>
-          <w:rFonts w:ascii="Times New Roman" w:eastAsia="Times New Roman" w:hAnsi="Times New Roman" w:cs="Times New Roman"/>
-          <w:sz w:val="24"/>
-          <w:szCs w:val="24"/>
-          <w:lang w:val="en-NG" w:eastAsia="en-NG"/>
-        </w:rPr>
-        <w:t xml:space="preserve">A distributed database is a single logical database that is dispersed physically over a number of geographically located computers that are linked together through a data communications network. From the users' point of </w:t>
-      </w:r>
-      <w:r>
-        <w:rPr>
-          <w:rFonts w:ascii="Times New Roman" w:eastAsia="Times New Roman" w:hAnsi="Times New Roman" w:cs="Times New Roman"/>
-          <w:sz w:val="24"/>
-          <w:szCs w:val="24"/>
-          <w:lang w:val="en-NG" w:eastAsia="en-NG"/>
-        </w:rPr>
-        <w:t>view,</w:t>
-      </w:r>
-      <w:r>
-        <w:rPr>
-          <w:rFonts w:ascii="Times New Roman" w:eastAsia="Times New Roman" w:hAnsi="Times New Roman" w:cs="Times New Roman"/>
-          <w:sz w:val="24"/>
-          <w:szCs w:val="24"/>
-          <w:lang w:val="en-NG" w:eastAsia="en-NG"/>
-        </w:rPr>
-        <w:t xml:space="preserve"> it appears to be a single, coherent database, but in fact the data will be distributed across many sites and maintained independently on different computers, (known as sites or nodes).</w:t>
-      </w:r>
-    </w:p>
-    <w:p>
-      <w:pPr>
-        <w:spacing w:before="100" w:beforeAutospacing="1" w:after="100" w:afterAutospacing="1" w:line="240" w:lineRule="auto"/>
-        <w:outlineLvl w:val="2"/>
-        <w:rPr>
-          <w:rFonts w:ascii="Times New Roman" w:eastAsia="Times New Roman" w:hAnsi="Times New Roman" w:cs="Times New Roman"/>
-          <w:sz w:val="24"/>
-          <w:szCs w:val="24"/>
-          <w:lang w:val="en-NG" w:eastAsia="en-NG"/>
-        </w:rPr>
-      </w:pPr>
-      <w:r>
-        <w:rPr>
-          <w:rFonts w:ascii="Times New Roman" w:eastAsia="Times New Roman" w:hAnsi="Times New Roman" w:cs="Times New Roman"/>
-          <w:sz w:val="24"/>
-          <w:szCs w:val="24"/>
-          <w:lang w:val="en-NG" w:eastAsia="en-NG"/>
-        </w:rPr>
-        <w:t>Each site will maintain its own local database, local DBMS and yet they will co-operate together in maintaining the global database. The main feature being that the system manipulates distributed data without any noticeable differences to the user.</w:t>
-      </w:r>
-    </w:p>
-    <w:p>
-      <w:pPr>
-        <w:spacing w:before="100" w:beforeAutospacing="1" w:after="100" w:afterAutospacing="1" w:line="240" w:lineRule="auto"/>
+        <w:jc w:val="both"/>
         <w:outlineLvl w:val="2"/>
         <w:rPr>
           <w:rFonts w:ascii="Times New Roman" w:eastAsia="Times New Roman" w:hAnsi="Times New Roman" w:cs="Times New Roman"/>
@@ -317,7 +307,7 @@
           <w:bCs/>
           <w:sz w:val="27"/>
           <w:szCs w:val="27"/>
-          <w:lang w:val="en-NG" w:eastAsia="en-NG"/>
+          <w:lang w:eastAsia="en-NG"/>
         </w:rPr>
       </w:pPr>
       <w:r>
@@ -327,34 +317,36 @@
           <w:bCs/>
           <w:sz w:val="27"/>
           <w:szCs w:val="27"/>
-          <w:lang w:val="en-NG" w:eastAsia="en-NG"/>
+          <w:lang w:eastAsia="en-NG"/>
         </w:rPr>
         <w:t>Transparency in Distributed Databases</w:t>
       </w:r>
     </w:p>
     <w:p>
       <w:pPr>
+        <w:spacing w:before="100" w:beforeAutospacing="1" w:after="100" w:afterAutospacing="1" w:line="360" w:lineRule="auto"/>
+        <w:jc w:val="both"/>
+        <w:rPr>
+          <w:rFonts w:ascii="Times New Roman" w:eastAsia="Times New Roman" w:hAnsi="Times New Roman" w:cs="Times New Roman"/>
+          <w:sz w:val="24"/>
+          <w:szCs w:val="24"/>
+          <w:lang w:eastAsia="en-NG"/>
+        </w:rPr>
+      </w:pPr>
+      <w:r>
+        <w:rPr>
+          <w:rFonts w:ascii="Times New Roman" w:eastAsia="Times New Roman" w:hAnsi="Times New Roman" w:cs="Times New Roman"/>
+          <w:sz w:val="24"/>
+          <w:szCs w:val="24"/>
+          <w:lang w:eastAsia="en-NG"/>
+        </w:rPr>
+        <w:t>Transparency in a distributed database system is the hiding of the distribution of data among sites and the underlying structure and mechanics of the distributed system itself. Essentially, transparency allows a user to treat the distributed database as a single monolithic centralized database and not need to worry about the how and where the data is physically stored.</w:t>
+      </w:r>
+    </w:p>
+    <w:p>
+      <w:pPr>
         <w:spacing w:before="100" w:beforeAutospacing="1" w:after="100" w:afterAutospacing="1" w:line="240" w:lineRule="auto"/>
-        <w:rPr>
-          <w:rFonts w:ascii="Times New Roman" w:eastAsia="Times New Roman" w:hAnsi="Times New Roman" w:cs="Times New Roman"/>
-          <w:sz w:val="24"/>
-          <w:szCs w:val="24"/>
-          <w:lang w:val="en-NG" w:eastAsia="en-NG"/>
-        </w:rPr>
-      </w:pPr>
-      <w:r>
-        <w:rPr>
-          <w:rFonts w:ascii="Times New Roman" w:eastAsia="Times New Roman" w:hAnsi="Times New Roman" w:cs="Times New Roman"/>
-          <w:sz w:val="24"/>
-          <w:szCs w:val="24"/>
-          <w:lang w:val="en-NG" w:eastAsia="en-NG"/>
-        </w:rPr>
-        <w:t>Transparency in a distributed database system is the hiding of the distribution of data among sites and the underlying structure and mechanics of the distributed system itself. Essentially, transparency allows a user to treat the distributed database as a single monolithic centralized database and not need to worry about the how and where the data is physically stored.</w:t>
-      </w:r>
-    </w:p>
-    <w:p>
-      <w:pPr>
-        <w:spacing w:before="100" w:beforeAutospacing="1" w:after="100" w:afterAutospacing="1" w:line="240" w:lineRule="auto"/>
+        <w:jc w:val="both"/>
         <w:outlineLvl w:val="2"/>
         <w:rPr>
           <w:rFonts w:ascii="Times New Roman" w:eastAsia="Times New Roman" w:hAnsi="Times New Roman" w:cs="Times New Roman"/>
@@ -362,52 +354,37 @@
           <w:bCs/>
           <w:sz w:val="27"/>
           <w:szCs w:val="27"/>
-          <w:lang w:val="en-NG" w:eastAsia="en-NG"/>
-        </w:rPr>
-      </w:pPr>
-      <w:r>
+          <w:lang w:eastAsia="en-NG"/>
+        </w:rPr>
+      </w:pPr>
+    </w:p>
+    <w:p>
+      <w:pPr>
+        <w:spacing w:before="100" w:beforeAutospacing="1" w:after="100" w:afterAutospacing="1" w:line="240" w:lineRule="auto"/>
+        <w:jc w:val="both"/>
+        <w:outlineLvl w:val="2"/>
         <w:rPr>
           <w:rFonts w:ascii="Times New Roman" w:eastAsia="Times New Roman" w:hAnsi="Times New Roman" w:cs="Times New Roman"/>
           <w:b/>
           <w:bCs/>
           <w:sz w:val="27"/>
           <w:szCs w:val="27"/>
-          <w:lang w:val="en-NG" w:eastAsia="en-NG"/>
-        </w:rPr>
-        <w:t>Types of Transparency</w:t>
-      </w:r>
+          <w:lang w:eastAsia="en-NG"/>
+        </w:rPr>
+      </w:pPr>
     </w:p>
     <w:p>
       <w:pPr>
         <w:spacing w:before="100" w:beforeAutospacing="1" w:after="100" w:afterAutospacing="1" w:line="240" w:lineRule="auto"/>
-        <w:rPr>
-          <w:rFonts w:ascii="Times New Roman" w:eastAsia="Times New Roman" w:hAnsi="Times New Roman" w:cs="Times New Roman"/>
-          <w:sz w:val="24"/>
-          <w:szCs w:val="24"/>
-          <w:lang w:val="en-NG" w:eastAsia="en-NG"/>
-        </w:rPr>
-      </w:pPr>
-      <w:r>
-        <w:rPr>
-          <w:rFonts w:ascii="Times New Roman" w:eastAsia="Times New Roman" w:hAnsi="Times New Roman" w:cs="Times New Roman"/>
-          <w:sz w:val="24"/>
-          <w:szCs w:val="24"/>
-          <w:lang w:val="en-NG" w:eastAsia="en-NG"/>
-        </w:rPr>
-        <w:t>The purpose of transparency is to hide the distribution of the database from the user. A DDBMS may aim to support the following types of transparency:</w:t>
-      </w:r>
-    </w:p>
-    <w:p>
-      <w:pPr>
-        <w:spacing w:before="100" w:beforeAutospacing="1" w:after="100" w:afterAutospacing="1" w:line="240" w:lineRule="auto"/>
-        <w:outlineLvl w:val="3"/>
+        <w:jc w:val="both"/>
+        <w:outlineLvl w:val="2"/>
         <w:rPr>
           <w:rFonts w:ascii="Times New Roman" w:eastAsia="Times New Roman" w:hAnsi="Times New Roman" w:cs="Times New Roman"/>
           <w:b/>
           <w:bCs/>
-          <w:sz w:val="24"/>
-          <w:szCs w:val="24"/>
-          <w:lang w:val="en-NG" w:eastAsia="en-NG"/>
+          <w:sz w:val="27"/>
+          <w:szCs w:val="27"/>
+          <w:lang w:eastAsia="en-NG"/>
         </w:rPr>
       </w:pPr>
       <w:r>
@@ -415,80 +392,112 @@
           <w:rFonts w:ascii="Times New Roman" w:eastAsia="Times New Roman" w:hAnsi="Times New Roman" w:cs="Times New Roman"/>
           <w:b/>
           <w:bCs/>
-          <w:sz w:val="24"/>
-          <w:szCs w:val="24"/>
-          <w:lang w:val="en-NG" w:eastAsia="en-NG"/>
+          <w:sz w:val="27"/>
+          <w:szCs w:val="27"/>
+          <w:lang w:eastAsia="en-NG"/>
+        </w:rPr>
+        <w:lastRenderedPageBreak/>
+        <w:t>Types of Transparency</w:t>
+      </w:r>
+    </w:p>
+    <w:p>
+      <w:pPr>
+        <w:spacing w:before="100" w:beforeAutospacing="1" w:after="100" w:afterAutospacing="1" w:line="360" w:lineRule="auto"/>
+        <w:jc w:val="both"/>
+        <w:rPr>
+          <w:rFonts w:ascii="Times New Roman" w:eastAsia="Times New Roman" w:hAnsi="Times New Roman" w:cs="Times New Roman"/>
+          <w:sz w:val="24"/>
+          <w:szCs w:val="24"/>
+          <w:lang w:eastAsia="en-NG"/>
+        </w:rPr>
+      </w:pPr>
+      <w:r>
+        <w:rPr>
+          <w:rFonts w:ascii="Times New Roman" w:eastAsia="Times New Roman" w:hAnsi="Times New Roman" w:cs="Times New Roman"/>
+          <w:sz w:val="24"/>
+          <w:szCs w:val="24"/>
+          <w:lang w:eastAsia="en-NG"/>
+        </w:rPr>
+        <w:t>The purpose of transparency is to hide the distribution of the database from the user. A DDBMS may aim to support the following types of transparency:</w:t>
+      </w:r>
+    </w:p>
+    <w:p>
+      <w:pPr>
+        <w:spacing w:before="100" w:beforeAutospacing="1" w:after="100" w:afterAutospacing="1" w:line="240" w:lineRule="auto"/>
+        <w:jc w:val="both"/>
+        <w:outlineLvl w:val="3"/>
+        <w:rPr>
+          <w:rFonts w:ascii="Times New Roman" w:eastAsia="Times New Roman" w:hAnsi="Times New Roman" w:cs="Times New Roman"/>
+          <w:b/>
+          <w:bCs/>
+          <w:sz w:val="24"/>
+          <w:szCs w:val="24"/>
+          <w:lang w:eastAsia="en-NG"/>
+        </w:rPr>
+      </w:pPr>
+      <w:r>
+        <w:rPr>
+          <w:rFonts w:ascii="Times New Roman" w:eastAsia="Times New Roman" w:hAnsi="Times New Roman" w:cs="Times New Roman"/>
+          <w:b/>
+          <w:bCs/>
+          <w:sz w:val="24"/>
+          <w:szCs w:val="24"/>
+          <w:lang w:eastAsia="en-NG"/>
         </w:rPr>
         <w:t>A. Fragmentation Transparency</w:t>
       </w:r>
     </w:p>
     <w:p>
       <w:pPr>
+        <w:spacing w:before="100" w:beforeAutospacing="1" w:after="100" w:afterAutospacing="1" w:line="360" w:lineRule="auto"/>
+        <w:jc w:val="both"/>
+        <w:rPr>
+          <w:rFonts w:ascii="Times New Roman" w:eastAsia="Times New Roman" w:hAnsi="Times New Roman" w:cs="Times New Roman"/>
+          <w:sz w:val="24"/>
+          <w:szCs w:val="24"/>
+          <w:lang w:eastAsia="en-NG"/>
+        </w:rPr>
+      </w:pPr>
+      <w:r>
+        <w:rPr>
+          <w:rFonts w:ascii="Times New Roman" w:eastAsia="Times New Roman" w:hAnsi="Times New Roman" w:cs="Times New Roman"/>
+          <w:sz w:val="24"/>
+          <w:szCs w:val="24"/>
+          <w:lang w:eastAsia="en-NG"/>
+        </w:rPr>
+        <w:t>This is the highest level of transparency. Transparency means that the user is not aware of the data fragmenting (partitioning) into multiple fragments. The user can query table as an entirety and the system do the work of aggregating fragments.</w:t>
+      </w:r>
+    </w:p>
+    <w:p>
+      <w:pPr>
         <w:spacing w:before="100" w:beforeAutospacing="1" w:after="100" w:afterAutospacing="1" w:line="240" w:lineRule="auto"/>
-        <w:rPr>
-          <w:rFonts w:ascii="Times New Roman" w:eastAsia="Times New Roman" w:hAnsi="Times New Roman" w:cs="Times New Roman"/>
-          <w:sz w:val="24"/>
-          <w:szCs w:val="24"/>
-          <w:lang w:val="en-NG" w:eastAsia="en-NG"/>
-        </w:rPr>
-      </w:pPr>
-      <w:r>
-        <w:rPr>
-          <w:rFonts w:ascii="Times New Roman" w:eastAsia="Times New Roman" w:hAnsi="Times New Roman" w:cs="Times New Roman"/>
-          <w:sz w:val="24"/>
-          <w:szCs w:val="24"/>
-          <w:lang w:val="en-NG" w:eastAsia="en-NG"/>
-        </w:rPr>
-        <w:lastRenderedPageBreak/>
-        <w:t xml:space="preserve">This is the highest level of transparency. Transparency means that the user is not aware of the data fragmenting (partitioning) into multiple fragments. The user can query table as an entirety and the system </w:t>
-      </w:r>
-      <w:r>
-        <w:rPr>
-          <w:rFonts w:ascii="Times New Roman" w:eastAsia="Times New Roman" w:hAnsi="Times New Roman" w:cs="Times New Roman"/>
-          <w:sz w:val="24"/>
-          <w:szCs w:val="24"/>
-          <w:lang w:val="en-NG" w:eastAsia="en-NG"/>
-        </w:rPr>
-        <w:t>do</w:t>
-      </w:r>
-      <w:r>
-        <w:rPr>
-          <w:rFonts w:ascii="Times New Roman" w:eastAsia="Times New Roman" w:hAnsi="Times New Roman" w:cs="Times New Roman"/>
-          <w:sz w:val="24"/>
-          <w:szCs w:val="24"/>
-          <w:lang w:val="en-NG" w:eastAsia="en-NG"/>
-        </w:rPr>
-        <w:t xml:space="preserve"> the work of aggregating fragments.</w:t>
+        <w:jc w:val="both"/>
+        <w:rPr>
+          <w:rFonts w:ascii="Times New Roman" w:eastAsia="Times New Roman" w:hAnsi="Times New Roman" w:cs="Times New Roman"/>
+          <w:sz w:val="24"/>
+          <w:szCs w:val="24"/>
+          <w:lang w:eastAsia="en-NG"/>
+        </w:rPr>
+      </w:pPr>
+      <w:r>
+        <w:rPr>
+          <w:rFonts w:ascii="Times New Roman" w:eastAsia="Times New Roman" w:hAnsi="Times New Roman" w:cs="Times New Roman"/>
+          <w:sz w:val="24"/>
+          <w:szCs w:val="24"/>
+          <w:lang w:eastAsia="en-NG"/>
+        </w:rPr>
+        <w:t>The image below illustrates this concept:</w:t>
       </w:r>
     </w:p>
     <w:p>
       <w:pPr>
         <w:spacing w:before="100" w:beforeAutospacing="1" w:after="100" w:afterAutospacing="1" w:line="240" w:lineRule="auto"/>
-        <w:rPr>
-          <w:rFonts w:ascii="Times New Roman" w:eastAsia="Times New Roman" w:hAnsi="Times New Roman" w:cs="Times New Roman"/>
-          <w:sz w:val="24"/>
-          <w:szCs w:val="24"/>
-          <w:lang w:val="en-NG" w:eastAsia="en-NG"/>
-        </w:rPr>
-      </w:pPr>
-      <w:r>
-        <w:rPr>
-          <w:rFonts w:ascii="Times New Roman" w:eastAsia="Times New Roman" w:hAnsi="Times New Roman" w:cs="Times New Roman"/>
-          <w:sz w:val="24"/>
-          <w:szCs w:val="24"/>
-          <w:lang w:val="en-NG" w:eastAsia="en-NG"/>
-        </w:rPr>
-        <w:t>The image below illustrates this concept:</w:t>
-      </w:r>
-    </w:p>
-    <w:p>
-      <w:pPr>
-        <w:spacing w:before="100" w:beforeAutospacing="1" w:after="100" w:afterAutospacing="1" w:line="240" w:lineRule="auto"/>
-        <w:rPr>
-          <w:rFonts w:ascii="Times New Roman" w:eastAsia="Times New Roman" w:hAnsi="Times New Roman" w:cs="Times New Roman"/>
-          <w:sz w:val="24"/>
-          <w:szCs w:val="24"/>
-          <w:lang w:val="en-NG" w:eastAsia="en-NG"/>
+        <w:jc w:val="both"/>
+        <w:rPr>
+          <w:rFonts w:ascii="Times New Roman" w:eastAsia="Times New Roman" w:hAnsi="Times New Roman" w:cs="Times New Roman"/>
+          <w:sz w:val="24"/>
+          <w:szCs w:val="24"/>
+          <w:lang w:eastAsia="en-NG"/>
         </w:rPr>
       </w:pPr>
       <w:r>
@@ -548,6 +557,7 @@
     <w:p>
       <w:pPr>
         <w:pStyle w:val="NormalWeb"/>
+        <w:jc w:val="both"/>
       </w:pPr>
       <w:r>
         <w:rPr>
@@ -564,6 +574,8 @@
           <w:ilvl w:val="0"/>
           <w:numId w:val="1"/>
         </w:numPr>
+        <w:spacing w:line="360" w:lineRule="auto"/>
+        <w:jc w:val="both"/>
       </w:pPr>
       <w:r>
         <w:t>The user at the computer perceives a single, complete database table (the thought bubble).</w:t>
@@ -576,6 +588,8 @@
           <w:ilvl w:val="0"/>
           <w:numId w:val="1"/>
         </w:numPr>
+        <w:spacing w:line="360" w:lineRule="auto"/>
+        <w:jc w:val="both"/>
       </w:pPr>
       <w:r>
         <w:t>In reality, the table is split into three fragments (Fragment 1, Fragment 2, and Fragment 3), each stored on a different server (Server A, Server B, and Server C).</w:t>
@@ -588,6 +602,8 @@
           <w:ilvl w:val="0"/>
           <w:numId w:val="1"/>
         </w:numPr>
+        <w:spacing w:line="360" w:lineRule="auto"/>
+        <w:jc w:val="both"/>
       </w:pPr>
       <w:r>
         <w:rPr>
@@ -599,14 +615,30 @@
     <w:p>
       <w:pPr>
         <w:pStyle w:val="Heading4"/>
-      </w:pPr>
-      <w:r>
+        <w:jc w:val="both"/>
+      </w:pPr>
+    </w:p>
+    <w:p>
+      <w:pPr>
+        <w:pStyle w:val="Heading4"/>
+        <w:jc w:val="both"/>
+      </w:pPr>
+    </w:p>
+    <w:p>
+      <w:pPr>
+        <w:pStyle w:val="Heading4"/>
+        <w:jc w:val="both"/>
+      </w:pPr>
+      <w:r>
+        <w:lastRenderedPageBreak/>
         <w:t>B. Replication Transparency</w:t>
       </w:r>
     </w:p>
     <w:p>
       <w:pPr>
         <w:pStyle w:val="NormalWeb"/>
+        <w:spacing w:line="360" w:lineRule="auto"/>
+        <w:jc w:val="both"/>
       </w:pPr>
       <w:r>
         <w:rPr>
@@ -621,6 +653,7 @@
     <w:p>
       <w:pPr>
         <w:pStyle w:val="NormalWeb"/>
+        <w:jc w:val="both"/>
       </w:pPr>
       <w:r>
         <w:t>The following image shows replication transparency in action:</w:t>
@@ -629,12 +662,12 @@
     <w:p>
       <w:pPr>
         <w:pStyle w:val="NormalWeb"/>
+        <w:jc w:val="both"/>
       </w:pPr>
       <w:r>
         <w:rPr>
           <w:noProof/>
         </w:rPr>
-        <w:lastRenderedPageBreak/>
         <w:drawing>
           <wp:inline distT="0" distB="0" distL="0" distR="0" wp14:anchorId="4ECCA49A" wp14:editId="536877FB">
             <wp:extent cx="5731510" cy="3126740"/>
@@ -686,6 +719,9 @@
       </w:r>
     </w:p>
     <w:p>
+      <w:pPr>
+        <w:jc w:val="both"/>
+      </w:pPr>
       <w:r>
         <w:rPr>
           <w:noProof/>
@@ -761,6 +797,7 @@
     <w:p>
       <w:pPr>
         <w:pStyle w:val="NormalWeb"/>
+        <w:jc w:val="both"/>
       </w:pPr>
       <w:r>
         <w:rPr>
@@ -777,6 +814,8 @@
           <w:ilvl w:val="0"/>
           <w:numId w:val="2"/>
         </w:numPr>
+        <w:spacing w:line="360" w:lineRule="auto"/>
+        <w:jc w:val="both"/>
       </w:pPr>
       <w:r>
         <w:rPr>
@@ -792,6 +831,8 @@
           <w:ilvl w:val="0"/>
           <w:numId w:val="2"/>
         </w:numPr>
+        <w:spacing w:line="360" w:lineRule="auto"/>
+        <w:jc w:val="both"/>
       </w:pPr>
       <w:r>
         <w:rPr>
@@ -807,6 +848,8 @@
           <w:ilvl w:val="0"/>
           <w:numId w:val="2"/>
         </w:numPr>
+        <w:spacing w:line="360" w:lineRule="auto"/>
+        <w:jc w:val="both"/>
       </w:pPr>
       <w:r>
         <w:rPr>
@@ -822,6 +865,8 @@
           <w:ilvl w:val="0"/>
           <w:numId w:val="2"/>
         </w:numPr>
+        <w:spacing w:line="360" w:lineRule="auto"/>
+        <w:jc w:val="both"/>
       </w:pPr>
       <w:r>
         <w:t>The user does not know or care that there are multiple copies; they just get their data.</w:t>
@@ -830,6 +875,7 @@
     <w:p>
       <w:pPr>
         <w:pStyle w:val="Heading4"/>
+        <w:jc w:val="both"/>
       </w:pPr>
       <w:r>
         <w:t>C. Location Transparency</w:t>
@@ -838,6 +884,8 @@
     <w:p>
       <w:pPr>
         <w:pStyle w:val="NormalWeb"/>
+        <w:spacing w:line="360" w:lineRule="auto"/>
+        <w:jc w:val="both"/>
       </w:pPr>
       <w:r>
         <w:rPr>
@@ -849,20 +897,22 @@
     <w:p>
       <w:pPr>
         <w:pStyle w:val="NormalWeb"/>
-      </w:pPr>
-      <w:r>
+        <w:jc w:val="both"/>
+      </w:pPr>
+      <w:r>
+        <w:lastRenderedPageBreak/>
         <w:t>The image below illustrates this:</w:t>
       </w:r>
     </w:p>
     <w:p>
       <w:pPr>
         <w:pStyle w:val="NormalWeb"/>
+        <w:jc w:val="both"/>
       </w:pPr>
       <w:r>
         <w:rPr>
           <w:noProof/>
         </w:rPr>
-        <w:lastRenderedPageBreak/>
         <w:drawing>
           <wp:inline distT="0" distB="0" distL="0" distR="0" wp14:anchorId="051720BD" wp14:editId="36FECE7A">
             <wp:extent cx="5731510" cy="3126740"/>
@@ -914,6 +964,9 @@
       </w:r>
     </w:p>
     <w:p>
+      <w:pPr>
+        <w:jc w:val="both"/>
+      </w:pPr>
       <w:r>
         <w:rPr>
           <w:noProof/>
@@ -989,6 +1042,7 @@
     <w:p>
       <w:pPr>
         <w:pStyle w:val="NormalWeb"/>
+        <w:jc w:val="both"/>
       </w:pPr>
       <w:r>
         <w:rPr>
@@ -1005,6 +1059,8 @@
           <w:ilvl w:val="0"/>
           <w:numId w:val="3"/>
         </w:numPr>
+        <w:spacing w:line="360" w:lineRule="auto"/>
+        <w:jc w:val="both"/>
       </w:pPr>
       <w:r>
         <w:t>The user queries the system for some data.</w:t>
@@ -1017,6 +1073,8 @@
           <w:ilvl w:val="0"/>
           <w:numId w:val="3"/>
         </w:numPr>
+        <w:spacing w:line="360" w:lineRule="auto"/>
+        <w:jc w:val="both"/>
       </w:pPr>
       <w:r>
         <w:t>The DDBMS determines that the required data is on Server C.</w:t>
@@ -1029,6 +1087,8 @@
           <w:ilvl w:val="0"/>
           <w:numId w:val="3"/>
         </w:numPr>
+        <w:spacing w:line="360" w:lineRule="auto"/>
+        <w:jc w:val="both"/>
       </w:pPr>
       <w:r>
         <w:t>The data is retrieved from Server C and sent to the user (highlighted path).</w:t>
@@ -1041,6 +1101,8 @@
           <w:ilvl w:val="0"/>
           <w:numId w:val="3"/>
         </w:numPr>
+        <w:spacing w:line="360" w:lineRule="auto"/>
+        <w:jc w:val="both"/>
       </w:pPr>
       <w:r>
         <w:t>The user's screen shows the data, but the user has no idea it came from a specific location (Server C).</w:t>
@@ -1048,9 +1110,25 @@
     </w:p>
     <w:p>
       <w:pPr>
-        <w:spacing w:before="100" w:beforeAutospacing="1" w:after="100" w:afterAutospacing="1" w:line="240" w:lineRule="auto"/>
+        <w:pStyle w:val="NormalWeb"/>
+        <w:spacing w:line="360" w:lineRule="auto"/>
+        <w:jc w:val="both"/>
         <w:rPr>
           <w:rStyle w:val="citation-104"/>
+        </w:rPr>
+      </w:pPr>
+      <w:r>
+        <w:rPr>
+          <w:rStyle w:val="citation-104"/>
+          <w:lang w:val="en-US"/>
+        </w:rPr>
+        <w:t>The distributed database is a strong and powerful system that saves data in distributed form but gives a view to the user that as if data is stored in a single site. Fragmentation, Replication and Location are the types of transparency features which cover-up the distributed form of the system, making it a simple and manageable system. All the type of transparency features is pictorially shown by the above images.</w:t>
+      </w:r>
+    </w:p>
+    <w:p>
+      <w:pPr>
+        <w:jc w:val="both"/>
+        <w:rPr>
           <w:rFonts w:ascii="Times New Roman" w:eastAsia="Times New Roman" w:hAnsi="Times New Roman" w:cs="Times New Roman"/>
           <w:sz w:val="24"/>
           <w:szCs w:val="24"/>
@@ -1065,40 +1143,8 @@
           <w:szCs w:val="24"/>
           <w:lang w:val="en-US" w:eastAsia="en-NG"/>
         </w:rPr>
-        <w:t>The distributed database is a strong and powerful system that saves data in distributed form but gives a view to the user that as if data is stored in a single site. Fragmentation, Replication and Location are the types of transparency features which cover-up the distributed form of the system, making it a simple and manageable system. All the type of transparency features is pictorially shown by the above images.</w:t>
-      </w:r>
-    </w:p>
-    <w:p>
-      <w:pPr>
-        <w:rPr>
-          <w:rStyle w:val="citation-104"/>
-          <w:rFonts w:ascii="Times New Roman" w:eastAsia="Times New Roman" w:hAnsi="Times New Roman" w:cs="Times New Roman"/>
-          <w:sz w:val="24"/>
-          <w:szCs w:val="24"/>
-          <w:lang w:val="en-US" w:eastAsia="en-NG"/>
-        </w:rPr>
-      </w:pPr>
-      <w:r>
-        <w:rPr>
-          <w:rStyle w:val="citation-104"/>
-          <w:rFonts w:ascii="Times New Roman" w:eastAsia="Times New Roman" w:hAnsi="Times New Roman" w:cs="Times New Roman"/>
-          <w:sz w:val="24"/>
-          <w:szCs w:val="24"/>
-          <w:lang w:val="en-US" w:eastAsia="en-NG"/>
-        </w:rPr>
         <w:br w:type="page"/>
       </w:r>
-    </w:p>
-    <w:p>
-      <w:pPr>
-        <w:spacing w:before="100" w:beforeAutospacing="1" w:after="100" w:afterAutospacing="1" w:line="240" w:lineRule="auto"/>
-        <w:rPr>
-          <w:rFonts w:ascii="Times New Roman" w:eastAsia="Times New Roman" w:hAnsi="Times New Roman" w:cs="Times New Roman"/>
-          <w:sz w:val="24"/>
-          <w:szCs w:val="24"/>
-          <w:lang w:val="en-US" w:eastAsia="en-NG"/>
-        </w:rPr>
-      </w:pPr>
       <w:r>
         <w:rPr>
           <w:rFonts w:ascii="Times New Roman" w:eastAsia="Times New Roman" w:hAnsi="Times New Roman" w:cs="Times New Roman"/>
@@ -1113,6 +1159,7 @@
     <w:p>
       <w:pPr>
         <w:spacing w:before="100" w:beforeAutospacing="1" w:after="100" w:afterAutospacing="1" w:line="240" w:lineRule="auto"/>
+        <w:jc w:val="both"/>
         <w:rPr>
           <w:rFonts w:ascii="Times New Roman" w:eastAsia="Times New Roman" w:hAnsi="Times New Roman" w:cs="Times New Roman"/>
           <w:sz w:val="24"/>
@@ -1136,6 +1183,7 @@
     <w:p>
       <w:pPr>
         <w:spacing w:before="100" w:beforeAutospacing="1" w:after="100" w:afterAutospacing="1" w:line="240" w:lineRule="auto"/>
+        <w:jc w:val="both"/>
         <w:rPr>
           <w:rFonts w:ascii="Times New Roman" w:eastAsia="Times New Roman" w:hAnsi="Times New Roman" w:cs="Times New Roman"/>
           <w:sz w:val="24"/>
@@ -1159,6 +1207,7 @@
     <w:p>
       <w:pPr>
         <w:spacing w:before="100" w:beforeAutospacing="1" w:after="100" w:afterAutospacing="1" w:line="240" w:lineRule="auto"/>
+        <w:jc w:val="both"/>
         <w:rPr>
           <w:rFonts w:ascii="Times New Roman" w:eastAsia="Times New Roman" w:hAnsi="Times New Roman" w:cs="Times New Roman"/>
           <w:sz w:val="24"/>
@@ -1182,6 +1231,7 @@
     <w:p>
       <w:pPr>
         <w:spacing w:before="100" w:beforeAutospacing="1" w:after="100" w:afterAutospacing="1" w:line="240" w:lineRule="auto"/>
+        <w:jc w:val="both"/>
         <w:rPr>
           <w:rFonts w:ascii="Times New Roman" w:eastAsia="Times New Roman" w:hAnsi="Times New Roman" w:cs="Times New Roman"/>
           <w:sz w:val="24"/>
@@ -1189,7 +1239,7 @@
           <w:lang w:val="en-US" w:eastAsia="en-NG"/>
         </w:rPr>
       </w:pPr>
-      <w:hyperlink r:id="rId12" w:history="1">
+      <w:hyperlink r:id="rId12" w:anchor=":~:text=The%20goal%20is%20to%20provide,to%20understand%20its%20distributed%20nature" w:history="1">
         <w:r>
           <w:rPr>
             <w:rStyle w:val="Hyperlink"/>
@@ -1214,6 +1264,7 @@
     <w:p>
       <w:pPr>
         <w:spacing w:before="100" w:beforeAutospacing="1" w:after="100" w:afterAutospacing="1" w:line="240" w:lineRule="auto"/>
+        <w:jc w:val="both"/>
         <w:rPr>
           <w:rFonts w:ascii="Times New Roman" w:eastAsia="Times New Roman" w:hAnsi="Times New Roman" w:cs="Times New Roman"/>
           <w:sz w:val="24"/>
@@ -1237,6 +1288,7 @@
     <w:p>
       <w:pPr>
         <w:spacing w:before="100" w:beforeAutospacing="1" w:after="100" w:afterAutospacing="1" w:line="240" w:lineRule="auto"/>
+        <w:jc w:val="both"/>
         <w:rPr>
           <w:rFonts w:ascii="Times New Roman" w:eastAsia="Times New Roman" w:hAnsi="Times New Roman" w:cs="Times New Roman"/>
           <w:sz w:val="24"/>
@@ -1260,6 +1312,7 @@
     <w:p>
       <w:pPr>
         <w:spacing w:before="100" w:beforeAutospacing="1" w:after="100" w:afterAutospacing="1" w:line="240" w:lineRule="auto"/>
+        <w:jc w:val="both"/>
         <w:rPr>
           <w:rFonts w:ascii="Times New Roman" w:eastAsia="Times New Roman" w:hAnsi="Times New Roman" w:cs="Times New Roman"/>
           <w:sz w:val="24"/>
@@ -1283,6 +1336,7 @@
     <w:p>
       <w:pPr>
         <w:spacing w:before="100" w:beforeAutospacing="1" w:after="100" w:afterAutospacing="1" w:line="240" w:lineRule="auto"/>
+        <w:jc w:val="both"/>
         <w:rPr>
           <w:rFonts w:ascii="Times New Roman" w:eastAsia="Times New Roman" w:hAnsi="Times New Roman" w:cs="Times New Roman"/>
           <w:sz w:val="24"/>
@@ -1306,6 +1360,7 @@
     <w:p>
       <w:pPr>
         <w:spacing w:before="100" w:beforeAutospacing="1" w:after="100" w:afterAutospacing="1" w:line="240" w:lineRule="auto"/>
+        <w:jc w:val="both"/>
         <w:rPr>
           <w:rFonts w:ascii="Times New Roman" w:eastAsia="Times New Roman" w:hAnsi="Times New Roman" w:cs="Times New Roman"/>
           <w:sz w:val="24"/>
@@ -1329,6 +1384,7 @@
     <w:p>
       <w:pPr>
         <w:spacing w:before="100" w:beforeAutospacing="1" w:after="100" w:afterAutospacing="1" w:line="240" w:lineRule="auto"/>
+        <w:jc w:val="both"/>
         <w:rPr>
           <w:rFonts w:ascii="Times New Roman" w:eastAsia="Times New Roman" w:hAnsi="Times New Roman" w:cs="Times New Roman"/>
           <w:sz w:val="24"/>
@@ -1339,6 +1395,7 @@
     </w:p>
     <w:p>
       <w:pPr>
+        <w:jc w:val="both"/>
         <w:rPr>
           <w:rFonts w:ascii="Times New Roman" w:hAnsi="Times New Roman" w:cs="Times New Roman"/>
           <w:sz w:val="24"/>
@@ -2234,7 +2291,7 @@
       <w:bCs/>
       <w:sz w:val="27"/>
       <w:szCs w:val="27"/>
-      <w:lang w:val="en-NG" w:eastAsia="en-NG"/>
+      <w:lang w:eastAsia="en-NG"/>
     </w:rPr>
   </w:style>
   <w:style w:type="paragraph" w:styleId="Heading4">
@@ -2254,7 +2311,7 @@
       <w:bCs/>
       <w:sz w:val="24"/>
       <w:szCs w:val="24"/>
-      <w:lang w:val="en-NG" w:eastAsia="en-NG"/>
+      <w:lang w:eastAsia="en-NG"/>
     </w:rPr>
   </w:style>
   <w:style w:type="character" w:default="1" w:styleId="DefaultParagraphFont">
@@ -2318,7 +2375,6 @@
     <w:name w:val="Normal (Web)"/>
     <w:basedOn w:val="Normal"/>
     <w:uiPriority w:val="99"/>
-    <w:semiHidden/>
     <w:unhideWhenUsed/>
     <w:rsid w:val="008625A3"/>
     <w:pPr>
@@ -2328,7 +2384,7 @@
       <w:rFonts w:ascii="Times New Roman" w:eastAsia="Times New Roman" w:hAnsi="Times New Roman" w:cs="Times New Roman"/>
       <w:sz w:val="24"/>
       <w:szCs w:val="24"/>
-      <w:lang w:val="en-NG" w:eastAsia="en-NG"/>
+      <w:lang w:eastAsia="en-NG"/>
     </w:rPr>
   </w:style>
   <w:style w:type="character" w:customStyle="1" w:styleId="citation-115">

</xml_diff>